<commit_message>
Cap nhat noi dung
</commit_message>
<xml_diff>
--- a/baocao.docx
+++ b/baocao.docx
@@ -1,6 +1,6 @@
 
 <file path=word/document.xml><?xml version="1.0" encoding="utf-8"?>
-<w:document xmlns:wpc="http://schemas.microsoft.com/office/word/2010/wordprocessingCanvas" xmlns:mc="http://schemas.openxmlformats.org/markup-compatibility/2006" xmlns:o="urn:schemas-microsoft-com:office:office" xmlns:r="http://schemas.openxmlformats.org/officeDocument/2006/relationships" xmlns:m="http://schemas.openxmlformats.org/officeDocument/2006/math" xmlns:v="urn:schemas-microsoft-com:vml" xmlns:wp14="http://schemas.microsoft.com/office/word/2010/wordprocessingDrawing" xmlns:wp="http://schemas.openxmlformats.org/drawingml/2006/wordprocessingDrawing" xmlns:w10="urn:schemas-microsoft-com:office:word" xmlns:w="http://schemas.openxmlformats.org/wordprocessingml/2006/main" xmlns:w14="http://schemas.microsoft.com/office/word/2010/wordml" xmlns:w15="http://schemas.microsoft.com/office/word/2012/wordml" xmlns:wpg="http://schemas.microsoft.com/office/word/2010/wordprocessingGroup" xmlns:wpi="http://schemas.microsoft.com/office/word/2010/wordprocessingInk" xmlns:wne="http://schemas.microsoft.com/office/word/2006/wordml" xmlns:wps="http://schemas.microsoft.com/office/word/2010/wordprocessingShape" mc:Ignorable="w14 w15 wp14">
+<w:document xmlns:wpc="http://schemas.microsoft.com/office/word/2010/wordprocessingCanvas" xmlns:cx="http://schemas.microsoft.com/office/drawing/2014/chartex" xmlns:cx1="http://schemas.microsoft.com/office/drawing/2015/9/8/chartex" xmlns:cx2="http://schemas.microsoft.com/office/drawing/2015/10/21/chartex" xmlns:cx3="http://schemas.microsoft.com/office/drawing/2016/5/9/chartex" xmlns:cx4="http://schemas.microsoft.com/office/drawing/2016/5/10/chartex" xmlns:cx5="http://schemas.microsoft.com/office/drawing/2016/5/11/chartex" xmlns:cx6="http://schemas.microsoft.com/office/drawing/2016/5/12/chartex" xmlns:cx7="http://schemas.microsoft.com/office/drawing/2016/5/13/chartex" xmlns:cx8="http://schemas.microsoft.com/office/drawing/2016/5/14/chartex" xmlns:mc="http://schemas.openxmlformats.org/markup-compatibility/2006" xmlns:aink="http://schemas.microsoft.com/office/drawing/2016/ink" xmlns:am3d="http://schemas.microsoft.com/office/drawing/2017/model3d" xmlns:o="urn:schemas-microsoft-com:office:office" xmlns:oel="http://schemas.microsoft.com/office/2019/extlst" xmlns:r="http://schemas.openxmlformats.org/officeDocument/2006/relationships" xmlns:m="http://schemas.openxmlformats.org/officeDocument/2006/math" xmlns:v="urn:schemas-microsoft-com:vml" xmlns:wp14="http://schemas.microsoft.com/office/word/2010/wordprocessingDrawing" xmlns:wp="http://schemas.openxmlformats.org/drawingml/2006/wordprocessingDrawing" xmlns:w10="urn:schemas-microsoft-com:office:word" xmlns:w="http://schemas.openxmlformats.org/wordprocessingml/2006/main" xmlns:w14="http://schemas.microsoft.com/office/word/2010/wordml" xmlns:w15="http://schemas.microsoft.com/office/word/2012/wordml" xmlns:w16cex="http://schemas.microsoft.com/office/word/2018/wordml/cex" xmlns:w16cid="http://schemas.microsoft.com/office/word/2016/wordml/cid" xmlns:w16="http://schemas.microsoft.com/office/word/2018/wordml" xmlns:w16du="http://schemas.microsoft.com/office/word/2023/wordml/word16du" xmlns:w16sdtdh="http://schemas.microsoft.com/office/word/2020/wordml/sdtdatahash" xmlns:w16sdtfl="http://schemas.microsoft.com/office/word/2024/wordml/sdtformatlock" xmlns:w16se="http://schemas.microsoft.com/office/word/2015/wordml/symex" xmlns:wpg="http://schemas.microsoft.com/office/word/2010/wordprocessingGroup" xmlns:wpi="http://schemas.microsoft.com/office/word/2010/wordprocessingInk" xmlns:wne="http://schemas.microsoft.com/office/word/2006/wordml" xmlns:wps="http://schemas.microsoft.com/office/word/2010/wordprocessingShape" mc:Ignorable="w14 w15 w16se w16cid w16 w16cex w16sdtdh w16sdtfl w16du wp14">
   <w:body>
     <w:p>
       <w:pPr>
@@ -71,7 +71,7 @@
           <w:szCs w:val="32"/>
         </w:rPr>
         <w:drawing>
-          <wp:inline distT="0" distB="0" distL="0" distR="0">
+          <wp:inline distT="0" distB="0" distL="0" distR="0" wp14:anchorId="6842F7E8" wp14:editId="6C2D603C">
             <wp:extent cx="841911" cy="841911"/>
             <wp:effectExtent l="0" t="0" r="0" b="0"/>
             <wp:docPr id="1" name="Picture 1"/>
@@ -146,7 +146,7 @@
           <w:sz w:val="32"/>
           <w:szCs w:val="32"/>
         </w:rPr>
-        <w:t>NGUYỄN VĂN BÉ MƯỜI HAI</w:t>
+        <w:t>THẠCH NGỌC PHÚ</w:t>
       </w:r>
     </w:p>
     <w:p>
@@ -190,7 +190,7 @@
           <w:sz w:val="36"/>
           <w:szCs w:val="36"/>
         </w:rPr>
-        <w:t xml:space="preserve"> QUẢN LÝ THIẾT BỊ TẠ</w:t>
+        <w:t xml:space="preserve"> QUẢN LÝ </w:t>
       </w:r>
       <w:r>
         <w:rPr>
@@ -198,16 +198,299 @@
           <w:sz w:val="36"/>
           <w:szCs w:val="36"/>
         </w:rPr>
-        <w:t xml:space="preserve">I PHÒNG </w:t>
-      </w:r>
-      <w:r>
+        <w:t>CỬA HÀNG BÁN NƯỚC HOA</w:t>
+      </w:r>
+    </w:p>
+    <w:p>
+      <w:pPr>
+        <w:jc w:val="center"/>
+        <w:rPr>
+          <w:b/>
+          <w:sz w:val="32"/>
+          <w:szCs w:val="32"/>
+        </w:rPr>
+      </w:pPr>
+    </w:p>
+    <w:p>
+      <w:pPr>
+        <w:jc w:val="center"/>
+        <w:rPr>
+          <w:b/>
+          <w:sz w:val="32"/>
+          <w:szCs w:val="32"/>
+        </w:rPr>
+      </w:pPr>
+    </w:p>
+    <w:p>
+      <w:pPr>
+        <w:jc w:val="center"/>
+        <w:rPr>
+          <w:b/>
+          <w:sz w:val="32"/>
+          <w:szCs w:val="32"/>
+        </w:rPr>
+      </w:pPr>
+    </w:p>
+    <w:p>
+      <w:pPr>
+        <w:jc w:val="center"/>
+        <w:rPr>
+          <w:b/>
+          <w:sz w:val="32"/>
+          <w:szCs w:val="32"/>
+        </w:rPr>
+      </w:pPr>
+    </w:p>
+    <w:p>
+      <w:pPr>
+        <w:jc w:val="center"/>
+        <w:rPr>
+          <w:b/>
+          <w:sz w:val="32"/>
+          <w:szCs w:val="32"/>
+        </w:rPr>
+      </w:pPr>
+      <w:r>
+        <w:rPr>
+          <w:b/>
+          <w:sz w:val="32"/>
+          <w:szCs w:val="32"/>
+        </w:rPr>
+        <w:t>ĐỒ ÁN MÔN HỌC</w:t>
+      </w:r>
+    </w:p>
+    <w:p>
+      <w:pPr>
+        <w:jc w:val="center"/>
+        <w:rPr>
+          <w:b/>
+          <w:sz w:val="32"/>
+          <w:szCs w:val="32"/>
+        </w:rPr>
+      </w:pPr>
+    </w:p>
+    <w:p>
+      <w:pPr>
+        <w:jc w:val="center"/>
+        <w:rPr>
+          <w:b/>
+          <w:sz w:val="32"/>
+          <w:szCs w:val="32"/>
+        </w:rPr>
+      </w:pPr>
+      <w:r>
+        <w:rPr>
+          <w:b/>
+          <w:sz w:val="32"/>
+          <w:szCs w:val="32"/>
+        </w:rPr>
+        <w:t>PHÁT TRIỂN ỨNG DỤNG WEB VỚI MÃ NGUỒN MỞ</w:t>
+      </w:r>
+    </w:p>
+    <w:p>
+      <w:pPr>
+        <w:jc w:val="center"/>
+        <w:rPr>
+          <w:b/>
+          <w:sz w:val="32"/>
+          <w:szCs w:val="32"/>
+        </w:rPr>
+      </w:pPr>
+    </w:p>
+    <w:p>
+      <w:pPr>
+        <w:jc w:val="center"/>
+        <w:rPr>
+          <w:b/>
+          <w:sz w:val="32"/>
+          <w:szCs w:val="32"/>
+        </w:rPr>
+      </w:pPr>
+    </w:p>
+    <w:p>
+      <w:pPr>
+        <w:jc w:val="center"/>
+        <w:rPr>
+          <w:b/>
+          <w:sz w:val="32"/>
+          <w:szCs w:val="32"/>
+        </w:rPr>
+      </w:pPr>
+    </w:p>
+    <w:p>
+      <w:pPr>
+        <w:jc w:val="center"/>
+        <w:rPr>
+          <w:b/>
+          <w:sz w:val="32"/>
+          <w:szCs w:val="32"/>
+        </w:rPr>
+      </w:pPr>
+    </w:p>
+    <w:p>
+      <w:pPr>
+        <w:jc w:val="center"/>
+        <w:rPr>
+          <w:b/>
+          <w:sz w:val="32"/>
+          <w:szCs w:val="32"/>
+        </w:rPr>
+      </w:pPr>
+    </w:p>
+    <w:p>
+      <w:pPr>
+        <w:jc w:val="center"/>
+        <w:rPr>
+          <w:b/>
+          <w:sz w:val="32"/>
+          <w:szCs w:val="32"/>
+        </w:rPr>
+      </w:pPr>
+      <w:r>
+        <w:rPr>
+          <w:b/>
+          <w:sz w:val="32"/>
+          <w:szCs w:val="32"/>
+        </w:rPr>
+        <w:t>VĨNH LONG</w:t>
+      </w:r>
+      <w:r>
+        <w:rPr>
+          <w:b/>
+          <w:sz w:val="32"/>
+          <w:szCs w:val="32"/>
+        </w:rPr>
+        <w:t>, NĂM 2026</w:t>
+      </w:r>
+    </w:p>
+    <w:p>
+      <w:pPr>
+        <w:jc w:val="center"/>
+        <w:rPr>
+          <w:sz w:val="32"/>
+          <w:szCs w:val="32"/>
+        </w:rPr>
+      </w:pPr>
+      <w:r>
+        <w:rPr>
+          <w:sz w:val="32"/>
+          <w:szCs w:val="32"/>
+        </w:rPr>
+        <w:lastRenderedPageBreak/>
+        <w:t>ĐẠI HỌC TRÀ VINH</w:t>
+      </w:r>
+    </w:p>
+    <w:p>
+      <w:pPr>
+        <w:jc w:val="center"/>
+        <w:rPr>
+          <w:b/>
+          <w:sz w:val="32"/>
+          <w:szCs w:val="32"/>
+        </w:rPr>
+      </w:pPr>
+      <w:r>
+        <w:rPr>
+          <w:b/>
+          <w:sz w:val="32"/>
+          <w:szCs w:val="32"/>
+        </w:rPr>
+        <w:t>TRƯỜNG KỸ THUẬT VÀ CÔNG NGHỆ</w:t>
+      </w:r>
+    </w:p>
+    <w:p>
+      <w:pPr>
+        <w:jc w:val="center"/>
+        <w:rPr>
+          <w:b/>
+        </w:rPr>
+      </w:pPr>
+    </w:p>
+    <w:p>
+      <w:pPr>
+        <w:jc w:val="center"/>
+        <w:rPr>
+          <w:b/>
+        </w:rPr>
+      </w:pPr>
+    </w:p>
+    <w:p>
+      <w:pPr>
+        <w:jc w:val="center"/>
+        <w:rPr>
+          <w:b/>
+        </w:rPr>
+      </w:pPr>
+    </w:p>
+    <w:p>
+      <w:pPr>
+        <w:jc w:val="center"/>
+        <w:rPr>
+          <w:b/>
+        </w:rPr>
+      </w:pPr>
+    </w:p>
+    <w:p>
+      <w:pPr>
+        <w:jc w:val="center"/>
         <w:rPr>
           <w:b/>
           <w:sz w:val="36"/>
           <w:szCs w:val="36"/>
         </w:rPr>
-        <w:t>CÔNG NGHỆ THÔNG TIN</w:t>
-      </w:r>
+      </w:pPr>
+      <w:r>
+        <w:rPr>
+          <w:b/>
+          <w:sz w:val="36"/>
+          <w:szCs w:val="36"/>
+        </w:rPr>
+        <w:t>XÂY DỰ</w:t>
+      </w:r>
+      <w:r>
+        <w:rPr>
+          <w:b/>
+          <w:sz w:val="36"/>
+          <w:szCs w:val="36"/>
+        </w:rPr>
+        <w:t xml:space="preserve">NG HỆ THỐNG </w:t>
+      </w:r>
+      <w:r>
+        <w:rPr>
+          <w:b/>
+          <w:sz w:val="36"/>
+          <w:szCs w:val="36"/>
+        </w:rPr>
+        <w:t xml:space="preserve">QUẢN LÝ </w:t>
+      </w:r>
+      <w:r>
+        <w:rPr>
+          <w:b/>
+          <w:sz w:val="36"/>
+          <w:szCs w:val="36"/>
+        </w:rPr>
+        <w:t>CỬA HÀNG BÁN NƯỚC HOA</w:t>
+      </w:r>
+    </w:p>
+    <w:p>
+      <w:pPr>
+        <w:jc w:val="center"/>
+        <w:rPr>
+          <w:b/>
+          <w:sz w:val="36"/>
+          <w:szCs w:val="36"/>
+        </w:rPr>
+      </w:pPr>
+    </w:p>
+    <w:p>
+      <w:pPr>
+        <w:jc w:val="center"/>
+        <w:rPr>
+          <w:b/>
+          <w:sz w:val="36"/>
+          <w:szCs w:val="36"/>
+        </w:rPr>
+      </w:pPr>
     </w:p>
     <w:p>
       <w:pPr>
@@ -218,16 +501,14 @@
           <w:szCs w:val="32"/>
         </w:rPr>
       </w:pPr>
-    </w:p>
-    <w:p>
-      <w:pPr>
-        <w:jc w:val="center"/>
+      <w:r>
         <w:rPr>
           <w:b/>
           <w:sz w:val="32"/>
           <w:szCs w:val="32"/>
         </w:rPr>
-      </w:pPr>
+        <w:t>ĐỒ ÁN MÔN HỌC</w:t>
+      </w:r>
     </w:p>
     <w:p>
       <w:pPr>
@@ -258,312 +539,15 @@
           <w:szCs w:val="32"/>
         </w:rPr>
       </w:pPr>
-      <w:r>
+    </w:p>
+    <w:p>
+      <w:pPr>
+        <w:jc w:val="center"/>
         <w:rPr>
           <w:b/>
           <w:sz w:val="32"/>
           <w:szCs w:val="32"/>
         </w:rPr>
-        <w:t>ĐỒ ÁN MÔN HỌC</w:t>
-      </w:r>
-    </w:p>
-    <w:p>
-      <w:pPr>
-        <w:jc w:val="center"/>
-        <w:rPr>
-          <w:b/>
-          <w:sz w:val="32"/>
-          <w:szCs w:val="32"/>
-        </w:rPr>
-      </w:pPr>
-    </w:p>
-    <w:p>
-      <w:pPr>
-        <w:jc w:val="center"/>
-        <w:rPr>
-          <w:b/>
-          <w:sz w:val="32"/>
-          <w:szCs w:val="32"/>
-        </w:rPr>
-      </w:pPr>
-      <w:r>
-        <w:rPr>
-          <w:b/>
-          <w:sz w:val="32"/>
-          <w:szCs w:val="32"/>
-        </w:rPr>
-        <w:t>PHÁT TRIỂN ỨNG DỤNG WEB VỚI MÃ NGUỒN MỞ</w:t>
-      </w:r>
-    </w:p>
-    <w:p>
-      <w:pPr>
-        <w:jc w:val="center"/>
-        <w:rPr>
-          <w:b/>
-          <w:sz w:val="32"/>
-          <w:szCs w:val="32"/>
-        </w:rPr>
-      </w:pPr>
-    </w:p>
-    <w:p>
-      <w:pPr>
-        <w:jc w:val="center"/>
-        <w:rPr>
-          <w:b/>
-          <w:sz w:val="32"/>
-          <w:szCs w:val="32"/>
-        </w:rPr>
-      </w:pPr>
-    </w:p>
-    <w:p>
-      <w:pPr>
-        <w:jc w:val="center"/>
-        <w:rPr>
-          <w:b/>
-          <w:sz w:val="32"/>
-          <w:szCs w:val="32"/>
-        </w:rPr>
-      </w:pPr>
-    </w:p>
-    <w:p>
-      <w:pPr>
-        <w:jc w:val="center"/>
-        <w:rPr>
-          <w:b/>
-          <w:sz w:val="32"/>
-          <w:szCs w:val="32"/>
-        </w:rPr>
-      </w:pPr>
-    </w:p>
-    <w:p>
-      <w:pPr>
-        <w:jc w:val="center"/>
-        <w:rPr>
-          <w:b/>
-          <w:sz w:val="32"/>
-          <w:szCs w:val="32"/>
-        </w:rPr>
-      </w:pPr>
-    </w:p>
-    <w:p>
-      <w:pPr>
-        <w:jc w:val="center"/>
-        <w:rPr>
-          <w:b/>
-          <w:sz w:val="32"/>
-          <w:szCs w:val="32"/>
-        </w:rPr>
-      </w:pPr>
-      <w:r>
-        <w:rPr>
-          <w:b/>
-          <w:sz w:val="32"/>
-          <w:szCs w:val="32"/>
-        </w:rPr>
-        <w:t>VĨNH LONG</w:t>
-      </w:r>
-      <w:r>
-        <w:rPr>
-          <w:b/>
-          <w:sz w:val="32"/>
-          <w:szCs w:val="32"/>
-        </w:rPr>
-        <w:t>, NĂM 2026</w:t>
-      </w:r>
-    </w:p>
-    <w:p>
-      <w:pPr>
-        <w:jc w:val="center"/>
-        <w:rPr>
-          <w:sz w:val="32"/>
-          <w:szCs w:val="32"/>
-        </w:rPr>
-      </w:pPr>
-      <w:r>
-        <w:rPr>
-          <w:sz w:val="32"/>
-          <w:szCs w:val="32"/>
-        </w:rPr>
-        <w:lastRenderedPageBreak/>
-        <w:t>ĐẠI HỌC TRÀ VINH</w:t>
-      </w:r>
-    </w:p>
-    <w:p>
-      <w:pPr>
-        <w:jc w:val="center"/>
-        <w:rPr>
-          <w:b/>
-          <w:sz w:val="32"/>
-          <w:szCs w:val="32"/>
-        </w:rPr>
-      </w:pPr>
-      <w:r>
-        <w:rPr>
-          <w:b/>
-          <w:sz w:val="32"/>
-          <w:szCs w:val="32"/>
-        </w:rPr>
-        <w:t>TRƯỜNG KỸ THUẬT VÀ CÔNG NGHỆ</w:t>
-      </w:r>
-    </w:p>
-    <w:p>
-      <w:pPr>
-        <w:jc w:val="center"/>
-        <w:rPr>
-          <w:b/>
-        </w:rPr>
-      </w:pPr>
-    </w:p>
-    <w:p>
-      <w:pPr>
-        <w:jc w:val="center"/>
-        <w:rPr>
-          <w:b/>
-        </w:rPr>
-      </w:pPr>
-    </w:p>
-    <w:p>
-      <w:pPr>
-        <w:jc w:val="center"/>
-        <w:rPr>
-          <w:b/>
-        </w:rPr>
-      </w:pPr>
-    </w:p>
-    <w:p>
-      <w:pPr>
-        <w:jc w:val="center"/>
-        <w:rPr>
-          <w:b/>
-        </w:rPr>
-      </w:pPr>
-    </w:p>
-    <w:p>
-      <w:pPr>
-        <w:jc w:val="center"/>
-        <w:rPr>
-          <w:b/>
-          <w:sz w:val="36"/>
-          <w:szCs w:val="36"/>
-        </w:rPr>
-      </w:pPr>
-      <w:r>
-        <w:rPr>
-          <w:b/>
-          <w:sz w:val="36"/>
-          <w:szCs w:val="36"/>
-        </w:rPr>
-        <w:t>XÂY DỰ</w:t>
-      </w:r>
-      <w:r>
-        <w:rPr>
-          <w:b/>
-          <w:sz w:val="36"/>
-          <w:szCs w:val="36"/>
-        </w:rPr>
-        <w:t xml:space="preserve">NG HỆ THỐNG </w:t>
-      </w:r>
-      <w:r>
-        <w:rPr>
-          <w:b/>
-          <w:sz w:val="36"/>
-          <w:szCs w:val="36"/>
-        </w:rPr>
-        <w:t>QUẢN LÝ THIẾT BỊ TẠ</w:t>
-      </w:r>
-      <w:r>
-        <w:rPr>
-          <w:b/>
-          <w:sz w:val="36"/>
-          <w:szCs w:val="36"/>
-        </w:rPr>
-        <w:t xml:space="preserve">I PHÒNG </w:t>
-      </w:r>
-      <w:r>
-        <w:rPr>
-          <w:b/>
-          <w:sz w:val="36"/>
-          <w:szCs w:val="36"/>
-        </w:rPr>
-        <w:t>KHOA CÔNG NGHỆ THÔNG TIN</w:t>
-      </w:r>
-    </w:p>
-    <w:p>
-      <w:pPr>
-        <w:jc w:val="center"/>
-        <w:rPr>
-          <w:b/>
-          <w:sz w:val="36"/>
-          <w:szCs w:val="36"/>
-        </w:rPr>
-      </w:pPr>
-    </w:p>
-    <w:p>
-      <w:pPr>
-        <w:jc w:val="center"/>
-        <w:rPr>
-          <w:b/>
-          <w:sz w:val="36"/>
-          <w:szCs w:val="36"/>
-        </w:rPr>
-      </w:pPr>
-    </w:p>
-    <w:p>
-      <w:pPr>
-        <w:jc w:val="center"/>
-        <w:rPr>
-          <w:b/>
-          <w:sz w:val="32"/>
-          <w:szCs w:val="32"/>
-        </w:rPr>
-      </w:pPr>
-      <w:r>
-        <w:rPr>
-          <w:b/>
-          <w:sz w:val="32"/>
-          <w:szCs w:val="32"/>
-        </w:rPr>
-        <w:t>ĐỒ ÁN MÔN HỌC</w:t>
-      </w:r>
-    </w:p>
-    <w:p>
-      <w:pPr>
-        <w:jc w:val="center"/>
-        <w:rPr>
-          <w:b/>
-          <w:sz w:val="32"/>
-          <w:szCs w:val="32"/>
-        </w:rPr>
-      </w:pPr>
-    </w:p>
-    <w:p>
-      <w:pPr>
-        <w:jc w:val="center"/>
-        <w:rPr>
-          <w:b/>
-          <w:sz w:val="32"/>
-          <w:szCs w:val="32"/>
-        </w:rPr>
-      </w:pPr>
-    </w:p>
-    <w:p>
-      <w:pPr>
-        <w:jc w:val="center"/>
-        <w:rPr>
-          <w:b/>
-          <w:sz w:val="32"/>
-          <w:szCs w:val="32"/>
-        </w:rPr>
-      </w:pPr>
-    </w:p>
-    <w:p>
-      <w:pPr>
-        <w:jc w:val="center"/>
-        <w:rPr>
-          <w:b/>
-          <w:sz w:val="32"/>
-          <w:szCs w:val="32"/>
-        </w:rPr>
       </w:pPr>
     </w:p>
     <w:p>
@@ -577,7 +561,10 @@
         <w:t>Sinh viên</w:t>
       </w:r>
       <w:r>
-        <w:t>: Nguyễn Văn Bé Mười Hai</w:t>
+        <w:t xml:space="preserve">: </w:t>
+      </w:r>
+      <w:r>
+        <w:t>Thạch Ngọc Phú</w:t>
       </w:r>
     </w:p>
     <w:p>
@@ -605,7 +592,10 @@
         <w:t>MSSV</w:t>
       </w:r>
       <w:r>
-        <w:t>: 110123001</w:t>
+        <w:t>: 110123</w:t>
+      </w:r>
+      <w:r>
+        <w:t>029</w:t>
       </w:r>
     </w:p>
     <w:p>
@@ -757,7 +747,7 @@
         <w:rPr>
           <w:b/>
         </w:rPr>
-        <w:t>Nguyễn Văn Bé Mười Hai</w:t>
+        <w:t>Thạch Ngọc Phú</w:t>
       </w:r>
     </w:p>
     <w:p>
@@ -3399,18 +3389,15 @@
         <w:lastRenderedPageBreak/>
         <w:t xml:space="preserve">: </w:t>
       </w:r>
-      <w:r>
-        <w:t>Tiêu đề chương 3</w:t>
-      </w:r>
       <w:bookmarkEnd w:id="18"/>
       <w:bookmarkEnd w:id="19"/>
+      <w:r>
+        <w:t>PHÂN TÍCH VÀ THIẾT KẾ HỆ THỐNG</w:t>
+      </w:r>
     </w:p>
     <w:p>
       <w:pPr>
         <w:pStyle w:val="Heading2"/>
-        <w:rPr>
-          <w:lang w:val="vi-VN"/>
-        </w:rPr>
       </w:pPr>
       <w:bookmarkStart w:id="20" w:name="_Toc240360227"/>
       <w:bookmarkStart w:id="21" w:name="_Toc240360370"/>
@@ -3425,6 +3412,39 @@
     </w:p>
     <w:p>
       <w:pPr>
+        <w:spacing w:before="120" w:after="120" w:line="360" w:lineRule="auto"/>
+        <w:ind w:firstLine="720"/>
+        <w:jc w:val="both"/>
+      </w:pPr>
+      <w:r>
+        <w:t>Kinh doanh nước hoa là ngành hàng đòi hỏi khắt khe về việc quản lý thông tin sản phẩm (thương hiệu, dung tích, mùi hương, số lượng tồn kho) và thông tin khách hàng thân thiết. Hiện nay, nhiều cửa hàng vừa và nhỏ vẫn quản lý bằng phương pháp thủ công hoặc ghi chép Excel. Cách làm này gây ra nhiều bất cập: dễ thất thoát hàng hóa, khó theo dõi hạn sử dụng hoặc số lượng tồn kho thực tế, quy trình tính tiền và in hóa đơn cho khách chậm trễ, và không có số liệu báo cáo doanh thu chính xác theo ngày/tháng.</w:t>
+      </w:r>
+    </w:p>
+    <w:p>
+      <w:pPr>
+        <w:spacing w:before="120" w:after="120" w:line="360" w:lineRule="auto"/>
+        <w:ind w:firstLine="720"/>
+        <w:jc w:val="both"/>
+      </w:pPr>
+      <w:r>
+        <w:t xml:space="preserve">Để tối </w:t>
+      </w:r>
+      <w:r>
+        <w:t xml:space="preserve">Để tối ưu hóa quy trình, phần mềm </w:t>
+      </w:r>
+      <w:r>
+        <w:rPr>
+          <w:b/>
+          <w:bCs/>
+        </w:rPr>
+        <w:t>"Hệ thống quản lý cửa hàng bán nước hoa"</w:t>
+      </w:r>
+      <w:r>
+        <w:t xml:space="preserve"> được xây dựng nhằm tin học hóa toàn bộ hoạt động kinh doanh. Hệ thống giúp lưu trữ tập trung thông tin sản phẩm gắn liền với thương hiệu và nhà cung cấp. Đồng thời, hệ thống hỗ trợ nhân viên bán hàng lập hóa đơn nhanh chóng, tự động trừ số lượng tồn kho, quản lý hồ sơ khách hàng để tích điểm, và hỗ trợ chủ cửa hàng theo dõi các biểu đồ báo cáo doanh thu, chi phí một cách trực quan, chính xác.</w:t>
+      </w:r>
+    </w:p>
+    <w:p>
+      <w:pPr>
         <w:pStyle w:val="Heading2"/>
         <w:rPr>
           <w:lang w:val="vi-VN"/>
@@ -3444,9 +3464,6 @@
     <w:p>
       <w:pPr>
         <w:pStyle w:val="Heading3"/>
-        <w:rPr>
-          <w:lang w:val="vi-VN"/>
-        </w:rPr>
       </w:pPr>
       <w:bookmarkStart w:id="24" w:name="_Toc240360229"/>
       <w:bookmarkStart w:id="25" w:name="_Toc240360372"/>
@@ -3461,10 +3478,123 @@
     </w:p>
     <w:p>
       <w:pPr>
+        <w:spacing w:before="120" w:after="120" w:line="360" w:lineRule="auto"/>
+        <w:ind w:firstLine="720"/>
+        <w:jc w:val="both"/>
+      </w:pPr>
+      <w:r>
+        <w:t>Hệ thống cần đáp ứng các nhóm chức năng cốt lõi sau dành cho 3 đối tượng người dùng (Người dùng thông thường/Giảng viên, Nhân viên quản lý thiết bị, và Quản trị trị hệ thống):</w:t>
+      </w:r>
+    </w:p>
+    <w:p>
+      <w:pPr>
+        <w:spacing w:before="120" w:after="120" w:line="360" w:lineRule="auto"/>
+        <w:ind w:firstLine="720"/>
+        <w:jc w:val="both"/>
+      </w:pPr>
+      <w:r>
+        <w:rPr>
+          <w:b/>
+          <w:bCs/>
+        </w:rPr>
+        <w:t>Quản lý tài khoản và phân quyền:</w:t>
+      </w:r>
+      <w:r>
+        <w:t xml:space="preserve"> Cho phép đăng nhập, đăng xuất, thay đổi mật khẩu và phân quyền chi tiết các chức năng dựa trên vai trò sử dụng.</w:t>
+      </w:r>
+    </w:p>
+    <w:p>
+      <w:pPr>
+        <w:spacing w:before="120" w:after="120" w:line="360" w:lineRule="auto"/>
+        <w:ind w:firstLine="720"/>
+        <w:jc w:val="both"/>
+      </w:pPr>
+      <w:r>
+        <w:t xml:space="preserve"> </w:t>
+      </w:r>
+      <w:r>
+        <w:rPr>
+          <w:b/>
+          <w:bCs/>
+        </w:rPr>
+        <w:t>Quản lý danh mục thiết bị:</w:t>
+      </w:r>
+      <w:r>
+        <w:t xml:space="preserve"> Hỗ trợ các thao tác Thêm, Xóa, Sửa, Tìm kiếm thông tin thiết bị (Tên, mã thiết bị, cấu hình, ngày nhập, hạn bảo hành, trạng thái).</w:t>
+      </w:r>
+    </w:p>
+    <w:p>
+      <w:pPr>
+        <w:spacing w:before="120" w:after="120" w:line="360" w:lineRule="auto"/>
+        <w:ind w:firstLine="720"/>
+        <w:jc w:val="both"/>
+      </w:pPr>
+      <w:r>
+        <w:rPr>
+          <w:b/>
+          <w:bCs/>
+        </w:rPr>
+        <w:lastRenderedPageBreak/>
+        <w:t>Quản lý phòng máy/vị trí:</w:t>
+      </w:r>
+      <w:r>
+        <w:t xml:space="preserve"> Theo dõi danh sách các phòng thực hành, phòng làm việc và danh sách thiết bị hiện có tại từng phòng.</w:t>
+      </w:r>
+    </w:p>
+    <w:p>
+      <w:pPr>
+        <w:spacing w:before="120" w:after="120" w:line="360" w:lineRule="auto"/>
+        <w:ind w:firstLine="720"/>
+        <w:jc w:val="both"/>
+      </w:pPr>
+      <w:r>
+        <w:rPr>
+          <w:b/>
+          <w:bCs/>
+        </w:rPr>
+        <w:t>Quản lý quy trình mượn - trả:</w:t>
+      </w:r>
+      <w:r>
+        <w:t xml:space="preserve"> Giảng viên/Nhân viên gửi yêu cầu đăng ký mượn thiết bị; Người quản lý tiếp nhận, phê duyệt hoặc từ chối; ghi nhận thời gian và trạng thái thiết bị lúc trả.</w:t>
+      </w:r>
+    </w:p>
+    <w:p>
+      <w:pPr>
+        <w:spacing w:before="120" w:after="120" w:line="360" w:lineRule="auto"/>
+        <w:ind w:firstLine="720"/>
+        <w:jc w:val="both"/>
+      </w:pPr>
+      <w:r>
+        <w:rPr>
+          <w:b/>
+          <w:bCs/>
+        </w:rPr>
+        <w:t>Quản lý bảo trì, sửa chữa:</w:t>
+      </w:r>
+      <w:r>
+        <w:t xml:space="preserve"> Ghi nhận các thiết bị hỏng, lập phiếu yêu cầu bảo trì, cập nhật chi phí và ngày hoàn thành bảo trì.</w:t>
+      </w:r>
+    </w:p>
+    <w:p>
+      <w:pPr>
+        <w:spacing w:before="120" w:after="120" w:line="360" w:lineRule="auto"/>
+        <w:ind w:firstLine="720"/>
+        <w:jc w:val="both"/>
+      </w:pPr>
+      <w:r>
+        <w:rPr>
+          <w:b/>
+          <w:bCs/>
+        </w:rPr>
+        <w:t>Thống kê và báo cáo:</w:t>
+      </w:r>
+      <w:r>
+        <w:t xml:space="preserve"> Tổng hợp số lượng thiết bị theo tình trạng (tốt, hỏng, đang mượn), xuất báo cáo định kỳ dưới dạng file Excel/PDF.</w:t>
+      </w:r>
+    </w:p>
+    <w:p>
+      <w:pPr>
         <w:pStyle w:val="Heading3"/>
-        <w:rPr>
-          <w:lang w:val="vi-VN"/>
-        </w:rPr>
       </w:pPr>
       <w:bookmarkStart w:id="26" w:name="_Toc240360230"/>
       <w:bookmarkStart w:id="27" w:name="_Toc240360373"/>
@@ -3479,10 +3609,88 @@
     </w:p>
     <w:p>
       <w:pPr>
+        <w:spacing w:before="120" w:after="120" w:line="360" w:lineRule="auto"/>
+        <w:ind w:firstLine="720"/>
+        <w:jc w:val="both"/>
+        <w:rPr>
+          <w:rFonts w:eastAsia="Times New Roman" w:cs="Times New Roman"/>
+          <w:szCs w:val="28"/>
+        </w:rPr>
+      </w:pPr>
+      <w:r>
+        <w:rPr>
+          <w:rFonts w:eastAsia="Times New Roman" w:cs="Times New Roman"/>
+          <w:b/>
+          <w:bCs/>
+          <w:szCs w:val="28"/>
+        </w:rPr>
+        <w:t>Tính an toàn và bảo mật:</w:t>
+      </w:r>
+      <w:r>
+        <w:rPr>
+          <w:rFonts w:eastAsia="Times New Roman" w:cs="Times New Roman"/>
+          <w:szCs w:val="28"/>
+        </w:rPr>
+        <w:t xml:space="preserve"> Mật khẩu người dùng phải được mã hóa trước khi lưu vào cơ sở dữ liệu. Hệ thống ngăn chặn các hình thức tấn công cơ bản như SQL Injection hay XSS.</w:t>
+      </w:r>
+    </w:p>
+    <w:p>
+      <w:pPr>
+        <w:spacing w:before="120" w:after="120" w:line="360" w:lineRule="auto"/>
+        <w:ind w:firstLine="720"/>
+        <w:jc w:val="both"/>
+        <w:rPr>
+          <w:rFonts w:eastAsia="Times New Roman" w:cs="Times New Roman"/>
+          <w:szCs w:val="28"/>
+        </w:rPr>
+      </w:pPr>
+      <w:r>
+        <w:rPr>
+          <w:rFonts w:eastAsia="Times New Roman" w:cs="Times New Roman"/>
+          <w:b/>
+          <w:bCs/>
+          <w:szCs w:val="28"/>
+        </w:rPr>
+        <w:t>Tính khả dụng (Hiệu năng):</w:t>
+      </w:r>
+      <w:r>
+        <w:rPr>
+          <w:rFonts w:eastAsia="Times New Roman" w:cs="Times New Roman"/>
+          <w:szCs w:val="28"/>
+        </w:rPr>
+        <w:t xml:space="preserve"> Giao diện web responsive, hoạt động mượt mà trên cả máy tính và thiết bị di động. Tốc độ phản hồi phản hồi các truy vấn tìm kiếm dữ liệu không quá 2 giây.</w:t>
+      </w:r>
+    </w:p>
+    <w:p>
+      <w:pPr>
+        <w:spacing w:before="120" w:after="120" w:line="360" w:lineRule="auto"/>
+        <w:ind w:firstLine="720"/>
+        <w:jc w:val="both"/>
+        <w:rPr>
+          <w:rFonts w:cs="Times New Roman"/>
+          <w:szCs w:val="28"/>
+        </w:rPr>
+      </w:pPr>
+      <w:r>
+        <w:rPr>
+          <w:rFonts w:eastAsia="Times New Roman" w:cs="Times New Roman"/>
+          <w:b/>
+          <w:bCs/>
+          <w:szCs w:val="28"/>
+        </w:rPr>
+        <w:t>Tính dễ bảo trì:</w:t>
+      </w:r>
+      <w:r>
+        <w:rPr>
+          <w:rFonts w:eastAsia="Times New Roman" w:cs="Times New Roman"/>
+          <w:szCs w:val="28"/>
+        </w:rPr>
+        <w:t xml:space="preserve"> Mã nguồn mở được tổ chức theo mô hình rõ ràng (như MVC), có chú thích đầy đủ để thuận tiện cho việc nâng cấp, mở rộng tính năng về sau.</w:t>
+      </w:r>
+    </w:p>
+    <w:p>
+      <w:pPr>
         <w:pStyle w:val="Heading2"/>
-        <w:rPr>
-          <w:lang w:val="vi-VN"/>
-        </w:rPr>
       </w:pPr>
       <w:bookmarkStart w:id="28" w:name="_Toc240360231"/>
       <w:bookmarkStart w:id="29" w:name="_Toc240360374"/>
@@ -3497,10 +3705,89 @@
     </w:p>
     <w:p>
       <w:pPr>
+        <w:spacing w:before="120" w:after="120" w:line="360" w:lineRule="auto"/>
+        <w:ind w:firstLine="720"/>
+        <w:jc w:val="both"/>
+      </w:pPr>
+      <w:r>
+        <w:t xml:space="preserve">Hệ thống được xây dựng trên kiến trúc </w:t>
+      </w:r>
+      <w:r>
+        <w:rPr>
+          <w:b/>
+          <w:bCs/>
+        </w:rPr>
+        <w:t>Client-Server</w:t>
+      </w:r>
+      <w:r>
+        <w:t xml:space="preserve"> kết hợp mô hình </w:t>
+      </w:r>
+      <w:r>
+        <w:rPr>
+          <w:b/>
+          <w:bCs/>
+        </w:rPr>
+        <w:t>MVC (Model-View-Controller)</w:t>
+      </w:r>
+      <w:r>
+        <w:t xml:space="preserve"> sử dụng mã nguồn mở.</w:t>
+      </w:r>
+    </w:p>
+    <w:p>
+      <w:pPr>
+        <w:spacing w:before="120" w:after="120" w:line="360" w:lineRule="auto"/>
+        <w:ind w:firstLine="720"/>
+        <w:jc w:val="both"/>
+      </w:pPr>
+      <w:r>
+        <w:rPr>
+          <w:b/>
+          <w:bCs/>
+        </w:rPr>
+        <w:t>Giao diện (View/Client):</w:t>
+      </w:r>
+      <w:r>
+        <w:t xml:space="preserve"> Phía người dùng sử dụng trình duyệt web hiển thị giao diện HTML5, CSS3, JavaScript tương tác trực tiếp qua các form, bảng dữ liệu.</w:t>
+      </w:r>
+    </w:p>
+    <w:p>
+      <w:pPr>
+        <w:spacing w:before="120" w:after="120" w:line="360" w:lineRule="auto"/>
+        <w:ind w:firstLine="720"/>
+        <w:jc w:val="both"/>
+      </w:pPr>
+      <w:r>
+        <w:rPr>
+          <w:b/>
+          <w:bCs/>
+        </w:rPr>
+        <w:lastRenderedPageBreak/>
+        <w:t>Bộ điều khiển &amp; Xử lý (Controller/Server):</w:t>
+      </w:r>
+      <w:r>
+        <w:t xml:space="preserve"> Sử dụng ngôn ngữ kịch bản phía Server để tiếp nhận các yêu cầu HTTP từ Client, thực hiện các logic nghiệp vụ và tương tác với cơ sở dữ liệu.</w:t>
+      </w:r>
+    </w:p>
+    <w:p>
+      <w:pPr>
+        <w:spacing w:before="120" w:after="120" w:line="360" w:lineRule="auto"/>
+        <w:ind w:firstLine="720"/>
+        <w:jc w:val="both"/>
+      </w:pPr>
+      <w:r>
+        <w:rPr>
+          <w:b/>
+          <w:bCs/>
+        </w:rPr>
+        <w:t>Tầng dữ liệu (Model/Database):</w:t>
+      </w:r>
+      <w:r>
+        <w:t xml:space="preserve"> Hệ quản trị cơ sở dữ liệu lưu trữ toàn bộ bảng thông tin và thực thi các câu lệnh truy vấn SQL thông qua kết nối an toàn từ Server.</w:t>
+      </w:r>
+    </w:p>
+    <w:p>
+      <w:pPr>
         <w:pStyle w:val="Heading2"/>
-        <w:rPr>
-          <w:lang w:val="vi-VN"/>
-        </w:rPr>
       </w:pPr>
       <w:bookmarkStart w:id="30" w:name="_Toc240360232"/>
       <w:bookmarkStart w:id="31" w:name="_Toc240360375"/>
@@ -3537,6 +3824,7 @@
       </w:pPr>
       <w:r>
         <w:rPr>
+          <w:noProof/>
           <w:lang w:val="vi-VN"/>
         </w:rPr>
         <w:drawing>
@@ -3602,6 +3890,9 @@
         <w:t>3.4.1</w:t>
       </w:r>
       <w:r>
+        <w:rPr>
+          <w:noProof/>
+        </w:rPr>
         <w:fldChar w:fldCharType="end"/>
       </w:r>
       <w:r>
@@ -3623,6 +3914,9 @@
         <w:t>1</w:t>
       </w:r>
       <w:r>
+        <w:rPr>
+          <w:noProof/>
+        </w:rPr>
         <w:fldChar w:fldCharType="end"/>
       </w:r>
       <w:r>
@@ -3711,8 +4005,6 @@
                 <w:lang w:val="vi-VN"/>
               </w:rPr>
             </w:pPr>
-            <w:bookmarkStart w:id="36" w:name="_GoBack"/>
-            <w:bookmarkEnd w:id="36"/>
           </w:p>
         </w:tc>
         <w:tc>
@@ -3972,22 +4264,76 @@
           <w:lang w:val="vi-VN"/>
         </w:rPr>
       </w:pPr>
-      <w:bookmarkStart w:id="37" w:name="_Toc240360235"/>
-      <w:bookmarkStart w:id="38" w:name="_Toc240360378"/>
+      <w:bookmarkStart w:id="36" w:name="_Toc240360235"/>
+      <w:bookmarkStart w:id="37" w:name="_Toc240360378"/>
       <w:r>
         <w:rPr>
           <w:lang w:val="vi-VN"/>
         </w:rPr>
         <w:t>Thiết kế xử lý</w:t>
       </w:r>
+      <w:bookmarkEnd w:id="36"/>
       <w:bookmarkEnd w:id="37"/>
+      <w:r>
+        <w:rPr>
+          <w:lang w:val="vi-VN"/>
+        </w:rPr>
+        <w:t xml:space="preserve"> </w:t>
+      </w:r>
+    </w:p>
+    <w:p>
+      <w:pPr>
+        <w:pStyle w:val="Heading3"/>
+        <w:rPr>
+          <w:lang w:val="vi-VN"/>
+        </w:rPr>
+      </w:pPr>
+      <w:bookmarkStart w:id="38" w:name="_Toc240360236"/>
+      <w:bookmarkStart w:id="39" w:name="_Toc240360379"/>
+      <w:r>
+        <w:rPr>
+          <w:lang w:val="vi-VN"/>
+        </w:rPr>
+        <w:t>Mô hình DFD mức ngữ cảnh</w:t>
+      </w:r>
       <w:bookmarkEnd w:id="38"/>
-      <w:r>
+      <w:bookmarkEnd w:id="39"/>
+    </w:p>
+    <w:p>
+      <w:pPr>
+        <w:pStyle w:val="Heading3"/>
         <w:rPr>
           <w:lang w:val="vi-VN"/>
         </w:rPr>
-        <w:t xml:space="preserve"> </w:t>
-      </w:r>
+      </w:pPr>
+      <w:bookmarkStart w:id="40" w:name="_Toc240360237"/>
+      <w:bookmarkStart w:id="41" w:name="_Toc240360380"/>
+      <w:r>
+        <w:rPr>
+          <w:lang w:val="vi-VN"/>
+        </w:rPr>
+        <w:t>Mô hình DFD phân rã chức năng</w:t>
+      </w:r>
+      <w:bookmarkEnd w:id="40"/>
+      <w:bookmarkEnd w:id="41"/>
+    </w:p>
+    <w:p>
+      <w:pPr>
+        <w:pStyle w:val="Heading2"/>
+        <w:rPr>
+          <w:lang w:val="vi-VN"/>
+        </w:rPr>
+      </w:pPr>
+      <w:bookmarkStart w:id="42" w:name="_Toc240360238"/>
+      <w:bookmarkStart w:id="43" w:name="_Toc240360381"/>
+      <w:r>
+        <w:rPr>
+          <w:lang w:val="vi-VN"/>
+        </w:rPr>
+        <w:t>Thiết kế giao diện</w:t>
+      </w:r>
+      <w:bookmarkEnd w:id="42"/>
+      <w:bookmarkEnd w:id="43"/>
     </w:p>
     <w:p>
       <w:pPr>
@@ -3996,16 +4342,16 @@
           <w:lang w:val="vi-VN"/>
         </w:rPr>
       </w:pPr>
-      <w:bookmarkStart w:id="39" w:name="_Toc240360236"/>
-      <w:bookmarkStart w:id="40" w:name="_Toc240360379"/>
+      <w:bookmarkStart w:id="44" w:name="_Toc240360239"/>
+      <w:bookmarkStart w:id="45" w:name="_Toc240360382"/>
       <w:r>
         <w:rPr>
           <w:lang w:val="vi-VN"/>
         </w:rPr>
-        <w:t>Mô hình DFD mức ngữ cảnh</w:t>
-      </w:r>
-      <w:bookmarkEnd w:id="39"/>
-      <w:bookmarkEnd w:id="40"/>
+        <w:t>Sơ đồ website</w:t>
+      </w:r>
+      <w:bookmarkEnd w:id="44"/>
+      <w:bookmarkEnd w:id="45"/>
     </w:p>
     <w:p>
       <w:pPr>
@@ -4014,119 +4360,65 @@
           <w:lang w:val="vi-VN"/>
         </w:rPr>
       </w:pPr>
-      <w:bookmarkStart w:id="41" w:name="_Toc240360237"/>
-      <w:bookmarkStart w:id="42" w:name="_Toc240360380"/>
+      <w:bookmarkStart w:id="46" w:name="_Toc240360240"/>
+      <w:bookmarkStart w:id="47" w:name="_Toc240360383"/>
       <w:r>
         <w:rPr>
           <w:lang w:val="vi-VN"/>
         </w:rPr>
-        <w:t>Mô hình DFD phân rã chức năng</w:t>
-      </w:r>
-      <w:bookmarkEnd w:id="41"/>
-      <w:bookmarkEnd w:id="42"/>
-    </w:p>
-    <w:p>
-      <w:pPr>
-        <w:pStyle w:val="Heading2"/>
+        <w:t>Phác thảo giao diện</w:t>
+      </w:r>
+      <w:bookmarkEnd w:id="46"/>
+      <w:bookmarkEnd w:id="47"/>
+    </w:p>
+    <w:p>
+      <w:pPr>
+        <w:pStyle w:val="Heading4"/>
         <w:rPr>
           <w:lang w:val="vi-VN"/>
         </w:rPr>
       </w:pPr>
-      <w:bookmarkStart w:id="43" w:name="_Toc240360238"/>
-      <w:bookmarkStart w:id="44" w:name="_Toc240360381"/>
       <w:r>
         <w:rPr>
           <w:lang w:val="vi-VN"/>
         </w:rPr>
-        <w:t>Thiết kế giao diện</w:t>
-      </w:r>
-      <w:bookmarkEnd w:id="43"/>
-      <w:bookmarkEnd w:id="44"/>
-    </w:p>
-    <w:p>
-      <w:pPr>
-        <w:pStyle w:val="Heading3"/>
+        <w:t>Giao diện 1</w:t>
+      </w:r>
+    </w:p>
+    <w:p>
+      <w:pPr>
+        <w:pStyle w:val="Heading4"/>
         <w:rPr>
           <w:lang w:val="vi-VN"/>
         </w:rPr>
       </w:pPr>
-      <w:bookmarkStart w:id="45" w:name="_Toc240360239"/>
-      <w:bookmarkStart w:id="46" w:name="_Toc240360382"/>
       <w:r>
         <w:rPr>
           <w:lang w:val="vi-VN"/>
         </w:rPr>
-        <w:t>Sơ đồ website</w:t>
-      </w:r>
-      <w:bookmarkEnd w:id="45"/>
-      <w:bookmarkEnd w:id="46"/>
-    </w:p>
-    <w:p>
-      <w:pPr>
-        <w:pStyle w:val="Heading3"/>
+        <w:t>Giao diện 2</w:t>
+      </w:r>
+    </w:p>
+    <w:p>
+      <w:pPr>
         <w:rPr>
           <w:lang w:val="vi-VN"/>
         </w:rPr>
       </w:pPr>
-      <w:bookmarkStart w:id="47" w:name="_Toc240360240"/>
-      <w:bookmarkStart w:id="48" w:name="_Toc240360383"/>
-      <w:r>
+    </w:p>
+    <w:p>
+      <w:pPr>
         <w:rPr>
           <w:lang w:val="vi-VN"/>
         </w:rPr>
-        <w:t>Phác thảo giao diện</w:t>
-      </w:r>
-      <w:bookmarkEnd w:id="47"/>
-      <w:bookmarkEnd w:id="48"/>
-    </w:p>
-    <w:p>
-      <w:pPr>
-        <w:pStyle w:val="Heading4"/>
-        <w:rPr>
-          <w:lang w:val="vi-VN"/>
-        </w:rPr>
-      </w:pPr>
-      <w:r>
-        <w:rPr>
-          <w:lang w:val="vi-VN"/>
-        </w:rPr>
-        <w:t>Giao diện 1</w:t>
-      </w:r>
-    </w:p>
-    <w:p>
-      <w:pPr>
-        <w:pStyle w:val="Heading4"/>
-        <w:rPr>
-          <w:lang w:val="vi-VN"/>
-        </w:rPr>
-      </w:pPr>
-      <w:r>
-        <w:rPr>
-          <w:lang w:val="vi-VN"/>
-        </w:rPr>
-        <w:t>Giao diện 2</w:t>
-      </w:r>
-    </w:p>
-    <w:p>
-      <w:pPr>
-        <w:rPr>
-          <w:lang w:val="vi-VN"/>
-        </w:rPr>
-      </w:pPr>
-    </w:p>
-    <w:p>
-      <w:pPr>
-        <w:rPr>
-          <w:lang w:val="vi-VN"/>
-        </w:rPr>
       </w:pPr>
     </w:p>
     <w:p>
       <w:pPr>
         <w:pStyle w:val="Heading1"/>
       </w:pPr>
-      <w:bookmarkStart w:id="49" w:name="_Toc240360241"/>
-      <w:bookmarkStart w:id="50" w:name="_Toc240360384"/>
+      <w:bookmarkStart w:id="48" w:name="_Toc240360241"/>
+      <w:bookmarkStart w:id="49" w:name="_Toc240360384"/>
       <w:r>
         <w:rPr>
           <w:lang w:val="vi-VN"/>
@@ -4137,8 +4429,8 @@
       <w:r>
         <w:t>Tiêu đề chương 4</w:t>
       </w:r>
+      <w:bookmarkEnd w:id="48"/>
       <w:bookmarkEnd w:id="49"/>
-      <w:bookmarkEnd w:id="50"/>
     </w:p>
     <w:p/>
     <w:p/>
@@ -4171,8 +4463,8 @@
       <w:pPr>
         <w:pStyle w:val="Heading1"/>
       </w:pPr>
-      <w:bookmarkStart w:id="51" w:name="_Toc240360242"/>
-      <w:bookmarkStart w:id="52" w:name="_Toc240360385"/>
+      <w:bookmarkStart w:id="50" w:name="_Toc240360242"/>
+      <w:bookmarkStart w:id="51" w:name="_Toc240360385"/>
       <w:r>
         <w:rPr>
           <w:lang w:val="vi-VN"/>
@@ -4183,8 +4475,8 @@
       <w:r>
         <w:t>Tiêu đề chương 5</w:t>
       </w:r>
+      <w:bookmarkEnd w:id="50"/>
       <w:bookmarkEnd w:id="51"/>
-      <w:bookmarkEnd w:id="52"/>
     </w:p>
     <w:p>
       <w:pPr>
@@ -4198,12 +4490,12 @@
       <w:pPr>
         <w:pStyle w:val="DEMUC"/>
       </w:pPr>
-      <w:bookmarkStart w:id="53" w:name="_Toc240360386"/>
+      <w:bookmarkStart w:id="52" w:name="_Toc240360386"/>
       <w:r>
         <w:lastRenderedPageBreak/>
         <w:t>TÀI LIỆU THAM KHẢO</w:t>
       </w:r>
-      <w:bookmarkEnd w:id="53"/>
+      <w:bookmarkEnd w:id="52"/>
     </w:p>
     <w:p>
       <w:pPr>
@@ -4217,12 +4509,12 @@
       <w:pPr>
         <w:pStyle w:val="DEMUC"/>
       </w:pPr>
-      <w:bookmarkStart w:id="54" w:name="_Toc240360387"/>
+      <w:bookmarkStart w:id="53" w:name="_Toc240360387"/>
       <w:r>
         <w:lastRenderedPageBreak/>
         <w:t>PHỤ LỤC</w:t>
       </w:r>
-      <w:bookmarkEnd w:id="54"/>
+      <w:bookmarkEnd w:id="53"/>
     </w:p>
     <w:p>
       <w:r>
@@ -4242,7 +4534,7 @@
 </file>
 
 <file path=word/endnotes.xml><?xml version="1.0" encoding="utf-8"?>
-<w:endnotes xmlns:wpc="http://schemas.microsoft.com/office/word/2010/wordprocessingCanvas" xmlns:mc="http://schemas.openxmlformats.org/markup-compatibility/2006" xmlns:o="urn:schemas-microsoft-com:office:office" xmlns:r="http://schemas.openxmlformats.org/officeDocument/2006/relationships" xmlns:m="http://schemas.openxmlformats.org/officeDocument/2006/math" xmlns:v="urn:schemas-microsoft-com:vml" xmlns:wp14="http://schemas.microsoft.com/office/word/2010/wordprocessingDrawing" xmlns:wp="http://schemas.openxmlformats.org/drawingml/2006/wordprocessingDrawing" xmlns:w10="urn:schemas-microsoft-com:office:word" xmlns:w="http://schemas.openxmlformats.org/wordprocessingml/2006/main" xmlns:w14="http://schemas.microsoft.com/office/word/2010/wordml" xmlns:w15="http://schemas.microsoft.com/office/word/2012/wordml" xmlns:wpg="http://schemas.microsoft.com/office/word/2010/wordprocessingGroup" xmlns:wpi="http://schemas.microsoft.com/office/word/2010/wordprocessingInk" xmlns:wne="http://schemas.microsoft.com/office/word/2006/wordml" xmlns:wps="http://schemas.microsoft.com/office/word/2010/wordprocessingShape" mc:Ignorable="w14 w15 wp14">
+<w:endnotes xmlns:wpc="http://schemas.microsoft.com/office/word/2010/wordprocessingCanvas" xmlns:cx="http://schemas.microsoft.com/office/drawing/2014/chartex" xmlns:cx1="http://schemas.microsoft.com/office/drawing/2015/9/8/chartex" xmlns:cx2="http://schemas.microsoft.com/office/drawing/2015/10/21/chartex" xmlns:cx3="http://schemas.microsoft.com/office/drawing/2016/5/9/chartex" xmlns:cx4="http://schemas.microsoft.com/office/drawing/2016/5/10/chartex" xmlns:cx5="http://schemas.microsoft.com/office/drawing/2016/5/11/chartex" xmlns:cx6="http://schemas.microsoft.com/office/drawing/2016/5/12/chartex" xmlns:cx7="http://schemas.microsoft.com/office/drawing/2016/5/13/chartex" xmlns:cx8="http://schemas.microsoft.com/office/drawing/2016/5/14/chartex" xmlns:mc="http://schemas.openxmlformats.org/markup-compatibility/2006" xmlns:aink="http://schemas.microsoft.com/office/drawing/2016/ink" xmlns:am3d="http://schemas.microsoft.com/office/drawing/2017/model3d" xmlns:o="urn:schemas-microsoft-com:office:office" xmlns:oel="http://schemas.microsoft.com/office/2019/extlst" xmlns:r="http://schemas.openxmlformats.org/officeDocument/2006/relationships" xmlns:m="http://schemas.openxmlformats.org/officeDocument/2006/math" xmlns:v="urn:schemas-microsoft-com:vml" xmlns:wp14="http://schemas.microsoft.com/office/word/2010/wordprocessingDrawing" xmlns:wp="http://schemas.openxmlformats.org/drawingml/2006/wordprocessingDrawing" xmlns:w10="urn:schemas-microsoft-com:office:word" xmlns:w="http://schemas.openxmlformats.org/wordprocessingml/2006/main" xmlns:w14="http://schemas.microsoft.com/office/word/2010/wordml" xmlns:w15="http://schemas.microsoft.com/office/word/2012/wordml" xmlns:w16cex="http://schemas.microsoft.com/office/word/2018/wordml/cex" xmlns:w16cid="http://schemas.microsoft.com/office/word/2016/wordml/cid" xmlns:w16="http://schemas.microsoft.com/office/word/2018/wordml" xmlns:w16du="http://schemas.microsoft.com/office/word/2023/wordml/word16du" xmlns:w16sdtdh="http://schemas.microsoft.com/office/word/2020/wordml/sdtdatahash" xmlns:w16sdtfl="http://schemas.microsoft.com/office/word/2024/wordml/sdtformatlock" xmlns:w16se="http://schemas.microsoft.com/office/word/2015/wordml/symex" xmlns:wpg="http://schemas.microsoft.com/office/word/2010/wordprocessingGroup" xmlns:wpi="http://schemas.microsoft.com/office/word/2010/wordprocessingInk" xmlns:wne="http://schemas.microsoft.com/office/word/2006/wordml" xmlns:wps="http://schemas.microsoft.com/office/word/2010/wordprocessingShape" mc:Ignorable="w14 w15 w16se w16cid w16 w16cex w16sdtdh w16sdtfl w16du wp14">
   <w:endnote w:type="separator" w:id="-1">
     <w:p>
       <w:pPr>
@@ -4267,7 +4559,7 @@
 </file>
 
 <file path=word/footnotes.xml><?xml version="1.0" encoding="utf-8"?>
-<w:footnotes xmlns:wpc="http://schemas.microsoft.com/office/word/2010/wordprocessingCanvas" xmlns:mc="http://schemas.openxmlformats.org/markup-compatibility/2006" xmlns:o="urn:schemas-microsoft-com:office:office" xmlns:r="http://schemas.openxmlformats.org/officeDocument/2006/relationships" xmlns:m="http://schemas.openxmlformats.org/officeDocument/2006/math" xmlns:v="urn:schemas-microsoft-com:vml" xmlns:wp14="http://schemas.microsoft.com/office/word/2010/wordprocessingDrawing" xmlns:wp="http://schemas.openxmlformats.org/drawingml/2006/wordprocessingDrawing" xmlns:w10="urn:schemas-microsoft-com:office:word" xmlns:w="http://schemas.openxmlformats.org/wordprocessingml/2006/main" xmlns:w14="http://schemas.microsoft.com/office/word/2010/wordml" xmlns:w15="http://schemas.microsoft.com/office/word/2012/wordml" xmlns:wpg="http://schemas.microsoft.com/office/word/2010/wordprocessingGroup" xmlns:wpi="http://schemas.microsoft.com/office/word/2010/wordprocessingInk" xmlns:wne="http://schemas.microsoft.com/office/word/2006/wordml" xmlns:wps="http://schemas.microsoft.com/office/word/2010/wordprocessingShape" mc:Ignorable="w14 w15 wp14">
+<w:footnotes xmlns:wpc="http://schemas.microsoft.com/office/word/2010/wordprocessingCanvas" xmlns:cx="http://schemas.microsoft.com/office/drawing/2014/chartex" xmlns:cx1="http://schemas.microsoft.com/office/drawing/2015/9/8/chartex" xmlns:cx2="http://schemas.microsoft.com/office/drawing/2015/10/21/chartex" xmlns:cx3="http://schemas.microsoft.com/office/drawing/2016/5/9/chartex" xmlns:cx4="http://schemas.microsoft.com/office/drawing/2016/5/10/chartex" xmlns:cx5="http://schemas.microsoft.com/office/drawing/2016/5/11/chartex" xmlns:cx6="http://schemas.microsoft.com/office/drawing/2016/5/12/chartex" xmlns:cx7="http://schemas.microsoft.com/office/drawing/2016/5/13/chartex" xmlns:cx8="http://schemas.microsoft.com/office/drawing/2016/5/14/chartex" xmlns:mc="http://schemas.openxmlformats.org/markup-compatibility/2006" xmlns:aink="http://schemas.microsoft.com/office/drawing/2016/ink" xmlns:am3d="http://schemas.microsoft.com/office/drawing/2017/model3d" xmlns:o="urn:schemas-microsoft-com:office:office" xmlns:oel="http://schemas.microsoft.com/office/2019/extlst" xmlns:r="http://schemas.openxmlformats.org/officeDocument/2006/relationships" xmlns:m="http://schemas.openxmlformats.org/officeDocument/2006/math" xmlns:v="urn:schemas-microsoft-com:vml" xmlns:wp14="http://schemas.microsoft.com/office/word/2010/wordprocessingDrawing" xmlns:wp="http://schemas.openxmlformats.org/drawingml/2006/wordprocessingDrawing" xmlns:w10="urn:schemas-microsoft-com:office:word" xmlns:w="http://schemas.openxmlformats.org/wordprocessingml/2006/main" xmlns:w14="http://schemas.microsoft.com/office/word/2010/wordml" xmlns:w15="http://schemas.microsoft.com/office/word/2012/wordml" xmlns:w16cex="http://schemas.microsoft.com/office/word/2018/wordml/cex" xmlns:w16cid="http://schemas.microsoft.com/office/word/2016/wordml/cid" xmlns:w16="http://schemas.microsoft.com/office/word/2018/wordml" xmlns:w16du="http://schemas.microsoft.com/office/word/2023/wordml/word16du" xmlns:w16sdtdh="http://schemas.microsoft.com/office/word/2020/wordml/sdtdatahash" xmlns:w16sdtfl="http://schemas.microsoft.com/office/word/2024/wordml/sdtformatlock" xmlns:w16se="http://schemas.microsoft.com/office/word/2015/wordml/symex" xmlns:wpg="http://schemas.microsoft.com/office/word/2010/wordprocessingGroup" xmlns:wpi="http://schemas.microsoft.com/office/word/2010/wordprocessingInk" xmlns:wne="http://schemas.microsoft.com/office/word/2006/wordml" xmlns:wps="http://schemas.microsoft.com/office/word/2010/wordprocessingShape" mc:Ignorable="w14 w15 w16se w16cid w16 w16cex w16sdtdh w16sdtfl w16du wp14">
   <w:footnote w:type="separator" w:id="-1">
     <w:p>
       <w:pPr>
@@ -4292,8 +4584,8 @@
 </file>
 
 <file path=word/numbering.xml><?xml version="1.0" encoding="utf-8"?>
-<w:numbering xmlns:wpc="http://schemas.microsoft.com/office/word/2010/wordprocessingCanvas" xmlns:mc="http://schemas.openxmlformats.org/markup-compatibility/2006" xmlns:o="urn:schemas-microsoft-com:office:office" xmlns:r="http://schemas.openxmlformats.org/officeDocument/2006/relationships" xmlns:m="http://schemas.openxmlformats.org/officeDocument/2006/math" xmlns:v="urn:schemas-microsoft-com:vml" xmlns:wp14="http://schemas.microsoft.com/office/word/2010/wordprocessingDrawing" xmlns:wp="http://schemas.openxmlformats.org/drawingml/2006/wordprocessingDrawing" xmlns:w10="urn:schemas-microsoft-com:office:word" xmlns:w="http://schemas.openxmlformats.org/wordprocessingml/2006/main" xmlns:w14="http://schemas.microsoft.com/office/word/2010/wordml" xmlns:w15="http://schemas.microsoft.com/office/word/2012/wordml" xmlns:wpg="http://schemas.microsoft.com/office/word/2010/wordprocessingGroup" xmlns:wpi="http://schemas.microsoft.com/office/word/2010/wordprocessingInk" xmlns:wne="http://schemas.microsoft.com/office/word/2006/wordml" xmlns:wps="http://schemas.microsoft.com/office/word/2010/wordprocessingShape" mc:Ignorable="w14 w15 wp14">
-  <w:abstractNum w:abstractNumId="0">
+<w:numbering xmlns:wpc="http://schemas.microsoft.com/office/word/2010/wordprocessingCanvas" xmlns:cx="http://schemas.microsoft.com/office/drawing/2014/chartex" xmlns:cx1="http://schemas.microsoft.com/office/drawing/2015/9/8/chartex" xmlns:cx2="http://schemas.microsoft.com/office/drawing/2015/10/21/chartex" xmlns:cx3="http://schemas.microsoft.com/office/drawing/2016/5/9/chartex" xmlns:cx4="http://schemas.microsoft.com/office/drawing/2016/5/10/chartex" xmlns:cx5="http://schemas.microsoft.com/office/drawing/2016/5/11/chartex" xmlns:cx6="http://schemas.microsoft.com/office/drawing/2016/5/12/chartex" xmlns:cx7="http://schemas.microsoft.com/office/drawing/2016/5/13/chartex" xmlns:cx8="http://schemas.microsoft.com/office/drawing/2016/5/14/chartex" xmlns:mc="http://schemas.openxmlformats.org/markup-compatibility/2006" xmlns:aink="http://schemas.microsoft.com/office/drawing/2016/ink" xmlns:am3d="http://schemas.microsoft.com/office/drawing/2017/model3d" xmlns:o="urn:schemas-microsoft-com:office:office" xmlns:oel="http://schemas.microsoft.com/office/2019/extlst" xmlns:r="http://schemas.openxmlformats.org/officeDocument/2006/relationships" xmlns:m="http://schemas.openxmlformats.org/officeDocument/2006/math" xmlns:v="urn:schemas-microsoft-com:vml" xmlns:wp14="http://schemas.microsoft.com/office/word/2010/wordprocessingDrawing" xmlns:wp="http://schemas.openxmlformats.org/drawingml/2006/wordprocessingDrawing" xmlns:w10="urn:schemas-microsoft-com:office:word" xmlns:w="http://schemas.openxmlformats.org/wordprocessingml/2006/main" xmlns:w14="http://schemas.microsoft.com/office/word/2010/wordml" xmlns:w15="http://schemas.microsoft.com/office/word/2012/wordml" xmlns:w16cex="http://schemas.microsoft.com/office/word/2018/wordml/cex" xmlns:w16cid="http://schemas.microsoft.com/office/word/2016/wordml/cid" xmlns:w16="http://schemas.microsoft.com/office/word/2018/wordml" xmlns:w16du="http://schemas.microsoft.com/office/word/2023/wordml/word16du" xmlns:w16sdtdh="http://schemas.microsoft.com/office/word/2020/wordml/sdtdatahash" xmlns:w16sdtfl="http://schemas.microsoft.com/office/word/2024/wordml/sdtformatlock" xmlns:w16se="http://schemas.microsoft.com/office/word/2015/wordml/symex" xmlns:wpg="http://schemas.microsoft.com/office/word/2010/wordprocessingGroup" xmlns:wpi="http://schemas.microsoft.com/office/word/2010/wordprocessingInk" xmlns:wne="http://schemas.microsoft.com/office/word/2006/wordml" xmlns:wps="http://schemas.microsoft.com/office/word/2010/wordprocessingShape" mc:Ignorable="w14 w15 w16se w16cid w16 w16cex w16sdtdh w16sdtfl w16du wp14">
+  <w:abstractNum w:abstractNumId="0" w15:restartNumberingAfterBreak="0">
     <w:nsid w:val="6A2B443D"/>
     <w:multiLevelType w:val="multilevel"/>
     <w:tmpl w:val="92A8CA18"/>
@@ -4431,26 +4723,26 @@
       </w:rPr>
     </w:lvl>
   </w:abstractNum>
-  <w:num w:numId="1">
+  <w:num w:numId="1" w16cid:durableId="1200626729">
     <w:abstractNumId w:val="0"/>
   </w:num>
-  <w:num w:numId="2">
+  <w:num w:numId="2" w16cid:durableId="659624890">
     <w:abstractNumId w:val="0"/>
   </w:num>
-  <w:num w:numId="3">
+  <w:num w:numId="3" w16cid:durableId="463424679">
     <w:abstractNumId w:val="0"/>
   </w:num>
-  <w:num w:numId="4">
+  <w:num w:numId="4" w16cid:durableId="851409213">
     <w:abstractNumId w:val="0"/>
   </w:num>
-  <w:num w:numId="5">
+  <w:num w:numId="5" w16cid:durableId="1367368665">
     <w:abstractNumId w:val="0"/>
   </w:num>
 </w:numbering>
 </file>
 
 <file path=word/styles.xml><?xml version="1.0" encoding="utf-8"?>
-<w:styles xmlns:mc="http://schemas.openxmlformats.org/markup-compatibility/2006" xmlns:r="http://schemas.openxmlformats.org/officeDocument/2006/relationships" xmlns:w="http://schemas.openxmlformats.org/wordprocessingml/2006/main" xmlns:w14="http://schemas.microsoft.com/office/word/2010/wordml" xmlns:w15="http://schemas.microsoft.com/office/word/2012/wordml" mc:Ignorable="w14 w15">
+<w:styles xmlns:mc="http://schemas.openxmlformats.org/markup-compatibility/2006" xmlns:r="http://schemas.openxmlformats.org/officeDocument/2006/relationships" xmlns:w="http://schemas.openxmlformats.org/wordprocessingml/2006/main" xmlns:w14="http://schemas.microsoft.com/office/word/2010/wordml" xmlns:w15="http://schemas.microsoft.com/office/word/2012/wordml" xmlns:w16cex="http://schemas.microsoft.com/office/word/2018/wordml/cex" xmlns:w16cid="http://schemas.microsoft.com/office/word/2016/wordml/cid" xmlns:w16="http://schemas.microsoft.com/office/word/2018/wordml" xmlns:w16du="http://schemas.microsoft.com/office/word/2023/wordml/word16du" xmlns:w16sdtdh="http://schemas.microsoft.com/office/word/2020/wordml/sdtdatahash" xmlns:w16sdtfl="http://schemas.microsoft.com/office/word/2024/wordml/sdtformatlock" xmlns:w16se="http://schemas.microsoft.com/office/word/2015/wordml/symex" mc:Ignorable="w14 w15 w16se w16cid w16 w16cex w16sdtdh w16sdtfl w16du">
   <w:docDefaults>
     <w:rPrDefault>
       <w:rPr>
@@ -4466,7 +4758,7 @@
       </w:pPr>
     </w:pPrDefault>
   </w:docDefaults>
-  <w:latentStyles w:defLockedState="0" w:defUIPriority="99" w:defSemiHidden="0" w:defUnhideWhenUsed="0" w:defQFormat="0" w:count="371">
+  <w:latentStyles w:defLockedState="0" w:defUIPriority="99" w:defSemiHidden="0" w:defUnhideWhenUsed="0" w:defQFormat="0" w:count="376">
     <w:lsdException w:name="Normal" w:uiPriority="0" w:qFormat="1"/>
     <w:lsdException w:name="heading 1" w:uiPriority="9" w:qFormat="1"/>
     <w:lsdException w:name="heading 2" w:semiHidden="1" w:uiPriority="9" w:unhideWhenUsed="1" w:qFormat="1"/>
@@ -4838,6 +5130,11 @@
     <w:lsdException w:name="List Table 5 Dark Accent 6" w:uiPriority="50"/>
     <w:lsdException w:name="List Table 6 Colorful Accent 6" w:uiPriority="51"/>
     <w:lsdException w:name="List Table 7 Colorful Accent 6" w:uiPriority="52"/>
+    <w:lsdException w:name="Mention" w:semiHidden="1" w:unhideWhenUsed="1"/>
+    <w:lsdException w:name="Smart Hyperlink" w:semiHidden="1" w:unhideWhenUsed="1"/>
+    <w:lsdException w:name="Hashtag" w:semiHidden="1" w:unhideWhenUsed="1"/>
+    <w:lsdException w:name="Unresolved Mention" w:semiHidden="1" w:unhideWhenUsed="1"/>
+    <w:lsdException w:name="Smart Link" w:semiHidden="1" w:unhideWhenUsed="1"/>
   </w:latentStyles>
   <w:style w:type="paragraph" w:default="1" w:styleId="Normal">
     <w:name w:val="Normal"/>
@@ -5087,7 +5384,6 @@
   <w:style w:type="character" w:default="1" w:styleId="DefaultParagraphFont">
     <w:name w:val="Default Paragraph Font"/>
     <w:uiPriority w:val="1"/>
-    <w:semiHidden/>
     <w:unhideWhenUsed/>
   </w:style>
   <w:style w:type="table" w:default="1" w:styleId="TableNormal">
@@ -5386,7 +5682,6 @@
       <w:spacing w:after="0" w:line="240" w:lineRule="auto"/>
     </w:pPr>
     <w:tblPr>
-      <w:tblInd w:w="0" w:type="dxa"/>
       <w:tblBorders>
         <w:top w:val="single" w:sz="4" w:space="0" w:color="auto"/>
         <w:left w:val="single" w:sz="4" w:space="0" w:color="auto"/>
@@ -5395,12 +5690,6 @@
         <w:insideH w:val="single" w:sz="4" w:space="0" w:color="auto"/>
         <w:insideV w:val="single" w:sz="4" w:space="0" w:color="auto"/>
       </w:tblBorders>
-      <w:tblCellMar>
-        <w:top w:w="0" w:type="dxa"/>
-        <w:left w:w="108" w:type="dxa"/>
-        <w:bottom w:w="0" w:type="dxa"/>
-        <w:right w:w="108" w:type="dxa"/>
-      </w:tblCellMar>
     </w:tblPr>
   </w:style>
   <w:style w:type="table" w:customStyle="1" w:styleId="myTable">
@@ -5416,7 +5705,6 @@
       <w:sz w:val="26"/>
     </w:rPr>
     <w:tblPr>
-      <w:tblInd w:w="0" w:type="dxa"/>
       <w:tblBorders>
         <w:top w:val="single" w:sz="4" w:space="0" w:color="000000" w:themeColor="text1"/>
         <w:left w:val="single" w:sz="4" w:space="0" w:color="000000" w:themeColor="text1"/>
@@ -5425,12 +5713,6 @@
         <w:insideH w:val="single" w:sz="4" w:space="0" w:color="000000" w:themeColor="text1"/>
         <w:insideV w:val="single" w:sz="4" w:space="0" w:color="000000" w:themeColor="text1"/>
       </w:tblBorders>
-      <w:tblCellMar>
-        <w:top w:w="0" w:type="dxa"/>
-        <w:left w:w="108" w:type="dxa"/>
-        <w:bottom w:w="0" w:type="dxa"/>
-        <w:right w:w="108" w:type="dxa"/>
-      </w:tblCellMar>
     </w:tblPr>
     <w:tblStylePr w:type="firstRow">
       <w:pPr>
@@ -5446,6 +5728,22 @@
         <w:jc w:val="center"/>
       </w:pPr>
     </w:tblStylePr>
+  </w:style>
+  <w:style w:type="character" w:customStyle="1" w:styleId="inqyif">
+    <w:name w:val="inqyif"/>
+    <w:basedOn w:val="DefaultParagraphFont"/>
+    <w:rsid w:val="002F5173"/>
+  </w:style>
+  <w:style w:type="character" w:styleId="Strong">
+    <w:name w:val="Strong"/>
+    <w:basedOn w:val="DefaultParagraphFont"/>
+    <w:uiPriority w:val="22"/>
+    <w:qFormat/>
+    <w:rsid w:val="002F5173"/>
+    <w:rPr>
+      <w:b/>
+      <w:bCs/>
+    </w:rPr>
   </w:style>
 </w:styles>
 </file>

</xml_diff>